<commit_message>
Expand site CV teaching section from portfolio
Adds course organisation (Political Communication, MA), selected
course lectures, MA thesis supervision, Digital Media Lab workshop
series, BA Humanities elective, and CUTL/RUCAI AI teaching project.
Teaching portfolio docx kept out of the public site repo.
</commit_message>
<xml_diff>
--- a/files/CV_site.docx
+++ b/files/CV_site.docx
@@ -557,6 +557,18 @@
     </w:p>
     <w:p>
       <w:pPr>
+        <w:spacing w:before="120" w:after="40"/>
+      </w:pPr>
+      <w:r>
+        <w:rPr>
+          <w:b/>
+          <w:i/>
+        </w:rPr>
+        <w:t>Course organisation and course teaching (selected)</w:t>
+      </w:r>
+    </w:p>
+    <w:p>
+      <w:pPr>
         <w:spacing w:after="40"/>
         <w:ind w:left="560" w:hanging="240"/>
       </w:pPr>
@@ -567,7 +579,7 @@
         <w:t xml:space="preserve">–  </w:t>
       </w:r>
       <w:r>
-        <w:t>Supervision across Journalism, Communication, Social Sciences, and Humanities programmes at Roskilde University.</w:t>
+        <w:t>“Political Communication in a Hybrid Media System” (MA Media and Communication, 10 ECTS) — course organiser and lecturer (3 of 8 sessions), Fall 2024 and Fall 2025 (with J. B. Kristensen).</w:t>
       </w:r>
     </w:p>
     <w:p>
@@ -582,7 +594,7 @@
         <w:t xml:space="preserve">–  </w:t>
       </w:r>
       <w:r>
-        <w:t>10+ BA semester projects (group-based, PPL format), 10+ MA projects (group and individual), and 1 completed MA thesis.</w:t>
+        <w:t>“Scientific Methods in Journalism Research” (MA Journalism) — lectures on quantitative and automated content analysis, Fall 2024–25.</w:t>
       </w:r>
     </w:p>
     <w:p>
@@ -597,7 +609,223 @@
         <w:t xml:space="preserve">–  </w:t>
       </w:r>
       <w:r>
-        <w:t>Teaching Assistant, “Theory of Science for Engineers” (ethics, SDGs, scientific knowledge production), DTU, 2019–2020.</w:t>
+        <w:t>“Digital Media: Strategy and Practices” (MA Communication) — research design and social analytics, Spring 2025 and Spring 2026.</w:t>
+      </w:r>
+    </w:p>
+    <w:p>
+      <w:pPr>
+        <w:spacing w:after="40"/>
+        <w:ind w:left="560" w:hanging="240"/>
+      </w:pPr>
+      <w:r>
+        <w:rPr>
+          <w:b/>
+        </w:rPr>
+        <w:t xml:space="preserve">–  </w:t>
+      </w:r>
+      <w:r>
+        <w:t>“Data and Things — Advanced Programming” (MA Computer Science) — large-scale network theory and AI, Spring 2026.</w:t>
+      </w:r>
+    </w:p>
+    <w:p>
+      <w:pPr>
+        <w:spacing w:after="40"/>
+        <w:ind w:left="560" w:hanging="240"/>
+      </w:pPr>
+      <w:r>
+        <w:rPr>
+          <w:b/>
+        </w:rPr>
+        <w:t xml:space="preserve">–  </w:t>
+      </w:r>
+      <w:r>
+        <w:t>“Responsible AI” (MA Computer Science) — AI and democracy, Fall 2025.</w:t>
+      </w:r>
+    </w:p>
+    <w:p>
+      <w:pPr>
+        <w:spacing w:after="40"/>
+        <w:ind w:left="560" w:hanging="240"/>
+      </w:pPr>
+      <w:r>
+        <w:rPr>
+          <w:b/>
+        </w:rPr>
+        <w:t xml:space="preserve">–  </w:t>
+      </w:r>
+      <w:r>
+        <w:t>“Journalism in war and crises” (MA Journalism) — disinformation and foreign interference, Fall 2022 and Fall 2025.</w:t>
+      </w:r>
+    </w:p>
+    <w:p>
+      <w:pPr>
+        <w:spacing w:after="40"/>
+        <w:ind w:left="560" w:hanging="240"/>
+      </w:pPr>
+      <w:r>
+        <w:rPr>
+          <w:b/>
+        </w:rPr>
+        <w:t xml:space="preserve">–  </w:t>
+      </w:r>
+      <w:r>
+        <w:t>“Journalistic Innovation” (MA Journalism) — supervision and examination of groups working with AI and news avoidance, Fall 2025.</w:t>
+      </w:r>
+    </w:p>
+    <w:p>
+      <w:pPr>
+        <w:spacing w:after="40"/>
+        <w:ind w:left="560" w:hanging="240"/>
+      </w:pPr>
+      <w:r>
+        <w:rPr>
+          <w:b/>
+        </w:rPr>
+        <w:t xml:space="preserve">–  </w:t>
+      </w:r>
+      <w:r>
+        <w:t>BA/MA lectures: “Journalism and Society” (BA Journalism, 2022), “Interaction, doxa, and networks” (MA Communication, 2022), “Sociology” (BA Social Sciences, 2021), “Trends in Digital Media and Communication Theory” (MA Communication, 2021).</w:t>
+      </w:r>
+    </w:p>
+    <w:p>
+      <w:pPr>
+        <w:spacing w:before="120" w:after="40"/>
+      </w:pPr>
+      <w:r>
+        <w:rPr>
+          <w:b/>
+          <w:i/>
+        </w:rPr>
+        <w:t>Supervision and examination</w:t>
+      </w:r>
+    </w:p>
+    <w:p>
+      <w:pPr>
+        <w:spacing w:after="40"/>
+        <w:ind w:left="560" w:hanging="240"/>
+      </w:pPr>
+      <w:r>
+        <w:rPr>
+          <w:b/>
+        </w:rPr>
+        <w:t xml:space="preserve">–  </w:t>
+      </w:r>
+      <w:r>
+        <w:t>10+ BA and 10+ MA project groups (PPL format) across the Journalism, Media and Communication, Social Sciences, and Humanities programmes at Roskilde University.</w:t>
+      </w:r>
+    </w:p>
+    <w:p>
+      <w:pPr>
+        <w:spacing w:after="40"/>
+        <w:ind w:left="560" w:hanging="240"/>
+      </w:pPr>
+      <w:r>
+        <w:rPr>
+          <w:b/>
+        </w:rPr>
+        <w:t xml:space="preserve">–  </w:t>
+      </w:r>
+      <w:r>
+        <w:t>MA thesis supervision (2 students, Spring 2025; thesis on media polarisation).</w:t>
+      </w:r>
+    </w:p>
+    <w:p>
+      <w:pPr>
+        <w:spacing w:before="120" w:after="40"/>
+      </w:pPr>
+      <w:r>
+        <w:rPr>
+          <w:b/>
+          <w:i/>
+        </w:rPr>
+        <w:t>Workshops and pedagogical development</w:t>
+      </w:r>
+    </w:p>
+    <w:p>
+      <w:pPr>
+        <w:spacing w:after="40"/>
+        <w:ind w:left="560" w:hanging="240"/>
+      </w:pPr>
+      <w:r>
+        <w:rPr>
+          <w:b/>
+        </w:rPr>
+        <w:t xml:space="preserve">–  </w:t>
+      </w:r>
+      <w:r>
+        <w:t>Digital Media Lab workshop series: programming for total beginners (2023–26), social media data collection (Digital Methods Initiative tools), computational text analysis.</w:t>
+      </w:r>
+    </w:p>
+    <w:p>
+      <w:pPr>
+        <w:spacing w:after="40"/>
+        <w:ind w:left="560" w:hanging="240"/>
+      </w:pPr>
+      <w:r>
+        <w:rPr>
+          <w:b/>
+        </w:rPr>
+        <w:t xml:space="preserve">–  </w:t>
+      </w:r>
+      <w:r>
+        <w:t>Designed and taught the BA Humanities elective “Social Media and Digital Methods” (2022; 65 students, 8 sessions).</w:t>
+      </w:r>
+    </w:p>
+    <w:p>
+      <w:pPr>
+        <w:spacing w:after="40"/>
+        <w:ind w:left="560" w:hanging="240"/>
+      </w:pPr>
+      <w:r>
+        <w:rPr>
+          <w:b/>
+        </w:rPr>
+        <w:t xml:space="preserve">–  </w:t>
+      </w:r>
+      <w:r>
+        <w:t>AI-supported PPL supervision chatbot (CUTL certificate project; presented to deans and university leadership, January 2026), continued and scaled as RUCAI through Digi4Hum.</w:t>
+      </w:r>
+    </w:p>
+    <w:p>
+      <w:pPr>
+        <w:spacing w:before="120" w:after="40"/>
+      </w:pPr>
+      <w:r>
+        <w:rPr>
+          <w:b/>
+          <w:i/>
+        </w:rPr>
+        <w:t>Earlier teaching</w:t>
+      </w:r>
+    </w:p>
+    <w:p>
+      <w:pPr>
+        <w:spacing w:after="40"/>
+        <w:ind w:left="560" w:hanging="240"/>
+      </w:pPr>
+      <w:r>
+        <w:rPr>
+          <w:b/>
+        </w:rPr>
+        <w:t xml:space="preserve">–  </w:t>
+      </w:r>
+      <w:r>
+        <w:t>Theory of Science for Engineers (DTU, 2019–2020): philosophy of knowledge, STS, ethics, UN Sustainable Development Goals.</w:t>
+      </w:r>
+    </w:p>
+    <w:p>
+      <w:pPr>
+        <w:spacing w:after="40"/>
+        <w:ind w:left="560" w:hanging="240"/>
+      </w:pPr>
+      <w:r>
+        <w:rPr>
+          <w:b/>
+        </w:rPr>
+        <w:t xml:space="preserve">–  </w:t>
+      </w:r>
+      <w:r>
+        <w:t>Sociological Theory and History of Ideas (UCPH, 2017); Open Workshop on practical learning (AAU, 2018).</w:t>
       </w:r>
     </w:p>
     <w:p>

</xml_diff>

<commit_message>
Add SSM 2020 article, teaching page, and FrederikWH.github.io target
- Add 'Investing in surgery or yoga among professions?' (Social
  Science & Medicine, 2020) to publications page and site CV
- Name the AAU-era team output in the CV; add Autumn 2026
  news-influencers elective to the teaching list
- Replace teaching page placeholder with course list (no essays)
- Set url/repository to FrederikWH.github.io; dev.sh now uses
  _config.dev.yml so local serving keeps localhost
</commit_message>
<xml_diff>
--- a/files/CV_site.docx
+++ b/files/CV_site.docx
@@ -358,7 +358,7 @@
         <w:t xml:space="preserve">–  </w:t>
       </w:r>
       <w:r>
-        <w:t>Supported mixed-method research (MCA, surveys, interviews) and workshop organisation; team output included two peer-reviewed articles.</w:t>
+        <w:t>Supported mixed-method research (MCA, surveys, interviews) and workshop organisation; team output includes peer-reviewed articles on body practices in the Danish healthcare field (see Publications).</w:t>
       </w:r>
     </w:p>
     <w:p>
@@ -579,6 +579,21 @@
         <w:t xml:space="preserve">–  </w:t>
       </w:r>
       <w:r>
+        <w:t>“News influencers in digital information environments” (elective) — 3–4 sessions, Autumn 2026.</w:t>
+      </w:r>
+    </w:p>
+    <w:p>
+      <w:pPr>
+        <w:spacing w:after="40"/>
+        <w:ind w:left="560" w:hanging="240"/>
+      </w:pPr>
+      <w:r>
+        <w:rPr>
+          <w:b/>
+        </w:rPr>
+        <w:t xml:space="preserve">–  </w:t>
+      </w:r>
+      <w:r>
         <w:t>“Political Communication in a Hybrid Media System” (MA Media and Communication, 10 ECTS) — course organiser and lecturer (3 of 8 sessions), Fall 2024 and Fall 2025 (with J. B. Kristensen).</w:t>
       </w:r>
     </w:p>
@@ -1122,6 +1137,40 @@
           <w:i/>
         </w:rPr>
         <w:t>Social Theory &amp; Health, 20(1). doi.org/10.1057/s41285-020-00151-z</w:t>
+      </w:r>
+    </w:p>
+    <w:p>
+      <w:pPr>
+        <w:spacing w:after="100"/>
+        <w:ind w:left="280" w:hanging="280"/>
+      </w:pPr>
+      <w:r>
+        <w:rPr>
+          <w:b/>
+          <w:i w:val="0"/>
+        </w:rPr>
+        <w:t xml:space="preserve">2020  </w:t>
+      </w:r>
+      <w:r>
+        <w:rPr>
+          <w:b w:val="0"/>
+          <w:i w:val="0"/>
+        </w:rPr>
+        <w:t xml:space="preserve">Larsen, K., Larsen, M. H., Henriksen, F. M., Nicolaisen, M. H., &amp; Hindhede, A. L. </w:t>
+      </w:r>
+      <w:r>
+        <w:rPr>
+          <w:b/>
+          <w:i w:val="0"/>
+        </w:rPr>
+        <w:t xml:space="preserve">Investing in surgery or yoga among professions?: Distinctions in health investments in the Danish healthcare field. </w:t>
+      </w:r>
+      <w:r>
+        <w:rPr>
+          <w:b w:val="0"/>
+          <w:i/>
+        </w:rPr>
+        <w:t>Social Science &amp; Medicine, 1–25.</w:t>
       </w:r>
     </w:p>
     <w:p>

</xml_diff>

<commit_message>
Remove unpublished SSM 2020 entry; GitHub handle FrederikWH90
The 'Investing in surgery or yoga' (SSM 2020) Scholar entry was
never published - it became 'Bodies need yoga?' (ST&H 2022).
AAU bullet now names the two actual articles. Config updated to
the renamed GitHub account FrederikWH90 (site becomes
FrederikWH90.github.io).
</commit_message>
<xml_diff>
--- a/files/CV_site.docx
+++ b/files/CV_site.docx
@@ -358,7 +358,7 @@
         <w:t xml:space="preserve">–  </w:t>
       </w:r>
       <w:r>
-        <w:t>Supported mixed-method research (MCA, surveys, interviews) and workshop organisation; team output includes peer-reviewed articles on body practices in the Danish healthcare field (see Publications).</w:t>
+        <w:t>Supported mixed-method research (MCA, surveys, interviews) and workshop organisation; team output includes two peer-reviewed articles on body practices in the Danish healthcare field (Praktiske Grunde, 2020; Social Theory &amp; Health, 2022 — see Publications).</w:t>
       </w:r>
     </w:p>
     <w:p>
@@ -1137,40 +1137,6 @@
           <w:i/>
         </w:rPr>
         <w:t>Social Theory &amp; Health, 20(1). doi.org/10.1057/s41285-020-00151-z</w:t>
-      </w:r>
-    </w:p>
-    <w:p>
-      <w:pPr>
-        <w:spacing w:after="100"/>
-        <w:ind w:left="280" w:hanging="280"/>
-      </w:pPr>
-      <w:r>
-        <w:rPr>
-          <w:b/>
-          <w:i w:val="0"/>
-        </w:rPr>
-        <w:t xml:space="preserve">2020  </w:t>
-      </w:r>
-      <w:r>
-        <w:rPr>
-          <w:b w:val="0"/>
-          <w:i w:val="0"/>
-        </w:rPr>
-        <w:t xml:space="preserve">Larsen, K., Larsen, M. H., Henriksen, F. M., Nicolaisen, M. H., &amp; Hindhede, A. L. </w:t>
-      </w:r>
-      <w:r>
-        <w:rPr>
-          <w:b/>
-          <w:i w:val="0"/>
-        </w:rPr>
-        <w:t xml:space="preserve">Investing in surgery or yoga among professions?: Distinctions in health investments in the Danish healthcare field. </w:t>
-      </w:r>
-      <w:r>
-        <w:rPr>
-          <w:b w:val="0"/>
-          <w:i/>
-        </w:rPr>
-        <w:t>Social Science &amp; Medicine, 1–25.</w:t>
       </w:r>
     </w:p>
     <w:p>

</xml_diff>